<commit_message>
update 3 before 4
</commit_message>
<xml_diff>
--- a/Burger_etal_2019/gyz043_suppl_supplement_material.docx
+++ b/Burger_etal_2019/gyz043_suppl_supplement_material.docx
@@ -3083,10 +3083,25 @@
 </FormTemplates>
 </file>
 
+<file path=customXml/item3.xml><?xml version="1.0" encoding="utf-8"?>
+<p:properties xmlns:p="http://schemas.microsoft.com/office/2006/metadata/properties" xmlns:xsi="http://www.w3.org/2001/XMLSchema-instance" xmlns:pc="http://schemas.microsoft.com/office/infopath/2007/PartnerControls">
+  <documentManagement>
+    <lcf76f155ced4ddcb4097134ff3c332f xmlns="8e1efd23-f4ba-42d2-85fd-6a510437bae6">
+      <Terms xmlns="http://schemas.microsoft.com/office/infopath/2007/PartnerControls"/>
+    </lcf76f155ced4ddcb4097134ff3c332f>
+    <TaxCatchAll xmlns="3bad6c6a-329d-45e9-b8b0-1ebecc8a8764" xsi:nil="true"/>
+  </documentManagement>
+</p:properties>
+</file>
+
 <file path=customXml/itemProps1.xml><?xml version="1.0" encoding="utf-8"?>
 <ds:datastoreItem xmlns:ds="http://schemas.openxmlformats.org/officeDocument/2006/customXml" ds:itemID="{876903E2-D244-4C4D-862D-6B6B4A2E238B}"/>
 </file>
 
 <file path=customXml/itemProps2.xml><?xml version="1.0" encoding="utf-8"?>
 <ds:datastoreItem xmlns:ds="http://schemas.openxmlformats.org/officeDocument/2006/customXml" ds:itemID="{BCC654FE-1BC1-4CEB-800D-AD4284BEAF47}"/>
+</file>
+
+<file path=customXml/itemProps3.xml><?xml version="1.0" encoding="utf-8"?>
+<ds:datastoreItem xmlns:ds="http://schemas.openxmlformats.org/officeDocument/2006/customXml" ds:itemID="{F7776E65-F224-416E-8BC2-189E7DDADAC9}"/>
 </file>
</xml_diff>

<commit_message>
more old changes and new changes
more old changes and new changes
</commit_message>
<xml_diff>
--- a/Burger_etal_2019/gyz043_suppl_supplement_material.docx
+++ b/Burger_etal_2019/gyz043_suppl_supplement_material.docx
@@ -3083,10 +3083,25 @@
 </FormTemplates>
 </file>
 
+<file path=customXml/item3.xml><?xml version="1.0" encoding="utf-8"?>
+<p:properties xmlns:p="http://schemas.microsoft.com/office/2006/metadata/properties" xmlns:xsi="http://www.w3.org/2001/XMLSchema-instance" xmlns:pc="http://schemas.microsoft.com/office/infopath/2007/PartnerControls">
+  <documentManagement>
+    <lcf76f155ced4ddcb4097134ff3c332f xmlns="8e1efd23-f4ba-42d2-85fd-6a510437bae6">
+      <Terms xmlns="http://schemas.microsoft.com/office/infopath/2007/PartnerControls"/>
+    </lcf76f155ced4ddcb4097134ff3c332f>
+    <TaxCatchAll xmlns="3bad6c6a-329d-45e9-b8b0-1ebecc8a8764" xsi:nil="true"/>
+  </documentManagement>
+</p:properties>
+</file>
+
 <file path=customXml/itemProps1.xml><?xml version="1.0" encoding="utf-8"?>
 <ds:datastoreItem xmlns:ds="http://schemas.openxmlformats.org/officeDocument/2006/customXml" ds:itemID="{876903E2-D244-4C4D-862D-6B6B4A2E238B}"/>
 </file>
 
 <file path=customXml/itemProps2.xml><?xml version="1.0" encoding="utf-8"?>
 <ds:datastoreItem xmlns:ds="http://schemas.openxmlformats.org/officeDocument/2006/customXml" ds:itemID="{BCC654FE-1BC1-4CEB-800D-AD4284BEAF47}"/>
+</file>
+
+<file path=customXml/itemProps3.xml><?xml version="1.0" encoding="utf-8"?>
+<ds:datastoreItem xmlns:ds="http://schemas.openxmlformats.org/officeDocument/2006/customXml" ds:itemID="{77A2FFD9-F7E9-4560-9DE5-C98446C280F5}"/>
 </file>
</xml_diff>